<commit_message>
docs: pindahkan tugas sqflite dari Abim ke Pras, modul warna ke Abim
</commit_message>
<xml_diff>
--- a/Pembagian Tugas/jobdesk-per-anggota.docx
+++ b/Pembagian Tugas/jobdesk-per-anggota.docx
@@ -68,6 +68,26 @@
       </w:r>
       <w:r>
         <w:t xml:space="preserve">.</w:t>
+      </w:r>
+    </w:p>
+    <w:p>
+      <w:pPr>
+        <w:pStyle w:val="BodyText"/>
+      </w:pPr>
+      <w:r>
+        <w:t xml:space="preserve">Perubahan 27 Oktober: tugas penyimpanan (E2) dipindahkan dari Abim ke</w:t>
+      </w:r>
+      <w:r>
+        <w:t xml:space="preserve"> </w:t>
+      </w:r>
+      <w:r>
+        <w:t xml:space="preserve">Faatihurrizki Prasojo (Pras). Sebagai penyeimbang, modul warna (E5) dan foto</w:t>
+      </w:r>
+      <w:r>
+        <w:t xml:space="preserve"> </w:t>
+      </w:r>
+      <w:r>
+        <w:t xml:space="preserve">lapangan (E10.2) pindah ke Abim.</w:t>
       </w:r>
     </w:p>
     <w:p>
@@ -158,7 +178,7 @@
               <w:jc w:val="left"/>
             </w:pPr>
             <w:r>
-              <w:t xml:space="preserve">Abim Mustawa</w:t>
+              <w:t xml:space="preserve">Faatihurrizki Prasojo</w:t>
             </w:r>
           </w:p>
         </w:tc>
@@ -329,51 +349,51 @@
               <w:jc w:val="left"/>
             </w:pPr>
             <w:r>
-              <w:t xml:space="preserve">Faatihurrizki Prasojo</w:t>
-            </w:r>
-          </w:p>
-        </w:tc>
-        <w:tc>
-          <w:p>
-            <w:pPr>
-              <w:pStyle w:val="Compact"/>
-              <w:jc w:val="left"/>
-            </w:pPr>
-            <w:r>
-              <w:t xml:space="preserve">Modul warna + data</w:t>
-            </w:r>
-          </w:p>
-        </w:tc>
-        <w:tc>
-          <w:p>
-            <w:pPr>
-              <w:pStyle w:val="Compact"/>
-              <w:jc w:val="left"/>
-            </w:pPr>
-            <w:r>
-              <w:t xml:space="preserve">E5.1–E5.4</w:t>
-            </w:r>
-          </w:p>
-        </w:tc>
-        <w:tc>
-          <w:p>
-            <w:pPr>
-              <w:pStyle w:val="Compact"/>
-              <w:jc w:val="right"/>
-            </w:pPr>
-            <w:r>
-              <w:t xml:space="preserve">5,0</w:t>
-            </w:r>
-          </w:p>
-        </w:tc>
-        <w:tc>
-          <w:p>
-            <w:pPr>
-              <w:pStyle w:val="Compact"/>
-              <w:jc w:val="right"/>
-            </w:pPr>
-            <w:r>
-              <w:t xml:space="preserve">2,0 (E4.1–E4.2)</w:t>
+              <w:t xml:space="preserve">Abim Mustawa</w:t>
+            </w:r>
+          </w:p>
+        </w:tc>
+        <w:tc>
+          <w:p>
+            <w:pPr>
+              <w:pStyle w:val="Compact"/>
+              <w:jc w:val="left"/>
+            </w:pPr>
+            <w:r>
+              <w:t xml:space="preserve">Modul warna + foto lapangan</w:t>
+            </w:r>
+          </w:p>
+        </w:tc>
+        <w:tc>
+          <w:p>
+            <w:pPr>
+              <w:pStyle w:val="Compact"/>
+              <w:jc w:val="left"/>
+            </w:pPr>
+            <w:r>
+              <w:t xml:space="preserve">E5.1–E5.4, E10.2</w:t>
+            </w:r>
+          </w:p>
+        </w:tc>
+        <w:tc>
+          <w:p>
+            <w:pPr>
+              <w:pStyle w:val="Compact"/>
+              <w:jc w:val="right"/>
+            </w:pPr>
+            <w:r>
+              <w:t xml:space="preserve">7,0</w:t>
+            </w:r>
+          </w:p>
+        </w:tc>
+        <w:tc>
+          <w:p>
+            <w:pPr>
+              <w:pStyle w:val="Compact"/>
+              <w:jc w:val="right"/>
+            </w:pPr>
+            <w:r>
+              <w:t xml:space="preserve">0</w:t>
             </w:r>
           </w:p>
         </w:tc>
@@ -397,40 +417,40 @@
               <w:jc w:val="left"/>
             </w:pPr>
             <w:r>
-              <w:t xml:space="preserve">QA, dokumentasi, foto</w:t>
-            </w:r>
-          </w:p>
-        </w:tc>
-        <w:tc>
-          <w:p>
-            <w:pPr>
-              <w:pStyle w:val="Compact"/>
-              <w:jc w:val="left"/>
-            </w:pPr>
-            <w:r>
-              <w:t xml:space="preserve">—</w:t>
-            </w:r>
-          </w:p>
-        </w:tc>
-        <w:tc>
-          <w:p>
-            <w:pPr>
-              <w:pStyle w:val="Compact"/>
-              <w:jc w:val="right"/>
-            </w:pPr>
-            <w:r>
-              <w:t xml:space="preserve">0</w:t>
-            </w:r>
-          </w:p>
-        </w:tc>
-        <w:tc>
-          <w:p>
-            <w:pPr>
-              <w:pStyle w:val="Compact"/>
-              <w:jc w:val="right"/>
-            </w:pPr>
-            <w:r>
-              <w:t xml:space="preserve">0</w:t>
+              <w:t xml:space="preserve">QA, dokumentasi, data ML</w:t>
+            </w:r>
+          </w:p>
+        </w:tc>
+        <w:tc>
+          <w:p>
+            <w:pPr>
+              <w:pStyle w:val="Compact"/>
+              <w:jc w:val="left"/>
+            </w:pPr>
+            <w:r>
+              <w:t xml:space="preserve">E9.1, E10.5, E8.2</w:t>
+            </w:r>
+          </w:p>
+        </w:tc>
+        <w:tc>
+          <w:p>
+            <w:pPr>
+              <w:pStyle w:val="Compact"/>
+              <w:jc w:val="right"/>
+            </w:pPr>
+            <w:r>
+              <w:t xml:space="preserve">5,5</w:t>
+            </w:r>
+          </w:p>
+        </w:tc>
+        <w:tc>
+          <w:p>
+            <w:pPr>
+              <w:pStyle w:val="Compact"/>
+              <w:jc w:val="right"/>
+            </w:pPr>
+            <w:r>
+              <w:t xml:space="preserve">2,0 (E4.1–E4.2)</w:t>
             </w:r>
           </w:p>
         </w:tc>
@@ -468,7 +488,7 @@
                 <w:bCs/>
                 <w:b/>
               </w:rPr>
-              <w:t xml:space="preserve">24,5</w:t>
+              <w:t xml:space="preserve">32,0</w:t>
             </w:r>
           </w:p>
         </w:tc>
@@ -494,7 +514,7 @@
         <w:pStyle w:val="BodyText"/>
       </w:pPr>
       <w:r>
-        <w:t xml:space="preserve">Tugas QA dan dokumentasi Ahmad (E9.1, E10.2, E10.5) dihitung terpisah: 6,0 ho.</w:t>
+        <w:t xml:space="preserve">Rentang beban 5,5–7,5 ho per orang, termasuk tugas ML.</w:t>
       </w:r>
     </w:p>
     <w:p>
@@ -505,13 +525,13 @@
       </w:r>
     </w:p>
     <w:bookmarkEnd w:id="20"/>
-    <w:bookmarkStart w:id="21" w:name="Xc513279eb932af3da3e714a2a61f70dd12ceeeb"/>
+    <w:bookmarkStart w:id="21" w:name="X4e97af2070831a523673087201ad3d3af7f877e"/>
     <w:p>
       <w:pPr>
         <w:pStyle w:val="Heading2"/>
       </w:pPr>
       <w:r>
-        <w:t xml:space="preserve">2. Abim Mustawa — penyimpanan (7,0 ho)</w:t>
+        <w:t xml:space="preserve">2. Faatihurrizki Prasojo — penyimpanan (7,0 ho)</w:t>
       </w:r>
     </w:p>
     <w:p>
@@ -519,13 +539,13 @@
         <w:pStyle w:val="FirstParagraph"/>
       </w:pPr>
       <w:r>
-        <w:t xml:space="preserve">Semua tugas ini adalah rantai yang tidak bisa dipotong. Setelah E2.1 selesai,</w:t>
+        <w:t xml:space="preserve">Rantai ini tidak bisa dipotong. Setelah E2.1 selesai, E2.2 dan E2.3 bisa</w:t>
       </w:r>
       <w:r>
         <w:t xml:space="preserve"> </w:t>
       </w:r>
       <w:r>
-        <w:t xml:space="preserve">E2.2 dan E2.3 bisa paralel; E2.4 menyusul; E2.5 dan E2.6 menutup.</w:t>
+        <w:t xml:space="preserve">paralel; E2.4 menyusul; E2.5 dan E2.6 menutup.</w:t>
       </w:r>
     </w:p>
     <w:tbl>
@@ -1222,7 +1242,43 @@
         <w:pStyle w:val="FirstParagraph"/>
       </w:pPr>
       <w:r>
-        <w:t xml:space="preserve">Karena itu E2.1 dan E2.2 adalah prioritas nomor satu di tim.</w:t>
+        <w:t xml:space="preserve">Karena itu E2.1 dan E2.2 tetap prioritas nomor satu di tim, meskipun pemiliknya</w:t>
+      </w:r>
+      <w:r>
+        <w:t xml:space="preserve"> </w:t>
+      </w:r>
+      <w:r>
+        <w:t xml:space="preserve">berganti. Branch yang dipakai:</w:t>
+      </w:r>
+      <w:r>
+        <w:t xml:space="preserve"> </w:t>
+      </w:r>
+      <w:r>
+        <w:rPr>
+          <w:rStyle w:val="VerbatimChar"/>
+        </w:rPr>
+        <w:t xml:space="preserve">feat/sqflite-setup</w:t>
+      </w:r>
+      <w:r>
+        <w:t xml:space="preserve"> </w:t>
+      </w:r>
+      <w:r>
+        <w:t xml:space="preserve">(buat ulang dari</w:t>
+      </w:r>
+      <w:r>
+        <w:t xml:space="preserve"> </w:t>
+      </w:r>
+      <w:r>
+        <w:rPr>
+          <w:rStyle w:val="VerbatimChar"/>
+        </w:rPr>
+        <w:t xml:space="preserve">main</w:t>
+      </w:r>
+      <w:r>
+        <w:t xml:space="preserve"> </w:t>
+      </w:r>
+      <w:r>
+        <w:t xml:space="preserve">karena branch lama sudah usang).</w:t>
       </w:r>
     </w:p>
     <w:p>
@@ -2392,13 +2448,7 @@
         <w:pStyle w:val="BodyText"/>
       </w:pPr>
       <w:r>
-        <w:t xml:space="preserve">E8.3 dan E8.5 sengaja ditaruh terakhir karena menunggu integrasi Model 3. Jangan</w:t>
-      </w:r>
-      <w:r>
-        <w:t xml:space="preserve"> </w:t>
-      </w:r>
-      <w:r>
-        <w:t xml:space="preserve">dikerjakan sebelum E7.4 selesai.</w:t>
+        <w:t xml:space="preserve">E8.3 dan E8.5 sengaja ditaruh terakhir karena menunggu integrasi Model 3.</w:t>
       </w:r>
     </w:p>
     <w:p>
@@ -2409,13 +2459,13 @@
       </w:r>
     </w:p>
     <w:bookmarkEnd w:id="23"/>
-    <w:bookmarkStart w:id="24" w:name="X3e79db577bae8e9fccf3c484803cfba4853193e"/>
+    <w:bookmarkStart w:id="24" w:name="X8ec7440f27a1ff19b01bd1fbc02c6f5be7b52a9"/>
     <w:p>
       <w:pPr>
         <w:pStyle w:val="Heading2"/>
       </w:pPr>
       <w:r>
-        <w:t xml:space="preserve">5. Faatihurrizki Prasojo — modul warna dan data (7,0 ho)</w:t>
+        <w:t xml:space="preserve">5. Abim Mustawa — modul warna dan foto lapangan (7,0 ho)</w:t>
       </w:r>
     </w:p>
     <w:tbl>
@@ -2839,29 +2889,29 @@
               <w:jc w:val="left"/>
             </w:pPr>
             <w:r>
-              <w:t xml:space="preserve">E4.1</w:t>
-            </w:r>
-          </w:p>
-        </w:tc>
-        <w:tc>
-          <w:p>
-            <w:pPr>
-              <w:pStyle w:val="Compact"/>
-              <w:jc w:val="left"/>
-            </w:pPr>
-            <w:r>
-              <w:t xml:space="preserve">Unduh dataset + EDA (tugas latar)</w:t>
-            </w:r>
-          </w:p>
-        </w:tc>
-        <w:tc>
-          <w:p>
-            <w:pPr>
-              <w:pStyle w:val="Compact"/>
-              <w:jc w:val="right"/>
-            </w:pPr>
-            <w:r>
-              <w:t xml:space="preserve">1,0</w:t>
+              <w:t xml:space="preserve">E10.2</w:t>
+            </w:r>
+          </w:p>
+        </w:tc>
+        <w:tc>
+          <w:p>
+            <w:pPr>
+              <w:pStyle w:val="Compact"/>
+              <w:jc w:val="left"/>
+            </w:pPr>
+            <w:r>
+              <w:t xml:space="preserve">150 foto lapangan untuk set uji</w:t>
+            </w:r>
+          </w:p>
+        </w:tc>
+        <w:tc>
+          <w:p>
+            <w:pPr>
+              <w:pStyle w:val="Compact"/>
+              <w:jc w:val="right"/>
+            </w:pPr>
+            <w:r>
+              <w:t xml:space="preserve">2,0</w:t>
             </w:r>
           </w:p>
         </w:tc>
@@ -2883,109 +2933,18 @@
               <w:jc w:val="left"/>
             </w:pPr>
             <w:r>
-              <w:t xml:space="preserve">Minggu 5</w:t>
-            </w:r>
-          </w:p>
-        </w:tc>
-        <w:tc>
-          <w:p>
-            <w:pPr>
-              <w:pStyle w:val="Compact"/>
-              <w:jc w:val="left"/>
-            </w:pPr>
-            <w:r>
-              <w:t xml:space="preserve">Dataset masuk</w:t>
-            </w:r>
-            <w:r>
-              <w:t xml:space="preserve"> </w:t>
-            </w:r>
-            <w:r>
-              <w:rPr>
-                <w:rStyle w:val="VerbatimChar"/>
-              </w:rPr>
-              <w:t xml:space="preserve">ml/data/raw/</w:t>
-            </w:r>
-            <w:r>
-              <w:t xml:space="preserve">, laporan EDA ada</w:t>
-            </w:r>
-          </w:p>
-        </w:tc>
-      </w:tr>
-      <w:tr>
-        <w:tc>
-          <w:p>
-            <w:pPr>
-              <w:pStyle w:val="Compact"/>
-              <w:jc w:val="right"/>
-            </w:pPr>
-            <w:r>
-              <w:t xml:space="preserve">6</w:t>
-            </w:r>
-          </w:p>
-        </w:tc>
-        <w:tc>
-          <w:p>
-            <w:pPr>
-              <w:pStyle w:val="Compact"/>
-              <w:jc w:val="left"/>
-            </w:pPr>
-            <w:r>
-              <w:t xml:space="preserve">E4.2</w:t>
-            </w:r>
-          </w:p>
-        </w:tc>
-        <w:tc>
-          <w:p>
-            <w:pPr>
-              <w:pStyle w:val="Compact"/>
-              <w:jc w:val="left"/>
-            </w:pPr>
-            <w:r>
-              <w:t xml:space="preserve">Gabung kelas + mapping + split</w:t>
-            </w:r>
-          </w:p>
-        </w:tc>
-        <w:tc>
-          <w:p>
-            <w:pPr>
-              <w:pStyle w:val="Compact"/>
-              <w:jc w:val="right"/>
-            </w:pPr>
-            <w:r>
-              <w:t xml:space="preserve">1,0</w:t>
-            </w:r>
-          </w:p>
-        </w:tc>
-        <w:tc>
-          <w:p>
-            <w:pPr>
-              <w:pStyle w:val="Compact"/>
-              <w:jc w:val="left"/>
-            </w:pPr>
-            <w:r>
-              <w:t xml:space="preserve">E4.1</w:t>
-            </w:r>
-          </w:p>
-        </w:tc>
-        <w:tc>
-          <w:p>
-            <w:pPr>
-              <w:pStyle w:val="Compact"/>
-              <w:jc w:val="left"/>
-            </w:pPr>
-            <w:r>
-              <w:t xml:space="preserve">Minggu 6</w:t>
-            </w:r>
-          </w:p>
-        </w:tc>
-        <w:tc>
-          <w:p>
-            <w:pPr>
-              <w:pStyle w:val="Compact"/>
-              <w:jc w:val="left"/>
-            </w:pPr>
-            <w:r>
-              <w:t xml:space="preserve">Mapping dan split tersimpan</w:t>
+              <w:t xml:space="preserve">Minggu 5–6</w:t>
+            </w:r>
+          </w:p>
+        </w:tc>
+        <w:tc>
+          <w:p>
+            <w:pPr>
+              <w:pStyle w:val="Compact"/>
+              <w:jc w:val="left"/>
+            </w:pPr>
+            <w:r>
+              <w:t xml:space="preserve">Set foto siap</w:t>
             </w:r>
           </w:p>
         </w:tc>
@@ -2996,13 +2955,37 @@
         <w:pStyle w:val="BodyText"/>
       </w:pPr>
       <w:r>
-        <w:t xml:space="preserve">E4.1 hanya butuh waktu unduh, bukan pengerjaan penuh. Kerjakan di sela E5,</w:t>
+        <w:t xml:space="preserve">Branch:</w:t>
       </w:r>
       <w:r>
         <w:t xml:space="preserve"> </w:t>
       </w:r>
       <w:r>
-        <w:t xml:space="preserve">jangan menunggu.</w:t>
+        <w:rPr>
+          <w:rStyle w:val="VerbatimChar"/>
+        </w:rPr>
+        <w:t xml:space="preserve">feat/color-crop</w:t>
+      </w:r>
+      <w:r>
+        <w:t xml:space="preserve"> </w:t>
+      </w:r>
+      <w:r>
+        <w:t xml:space="preserve">untuk E5.1, lalu</w:t>
+      </w:r>
+      <w:r>
+        <w:t xml:space="preserve"> </w:t>
+      </w:r>
+      <w:r>
+        <w:rPr>
+          <w:rStyle w:val="VerbatimChar"/>
+        </w:rPr>
+        <w:t xml:space="preserve">feat/color-kmeans</w:t>
+      </w:r>
+      <w:r>
+        <w:t xml:space="preserve"> </w:t>
+      </w:r>
+      <w:r>
+        <w:t xml:space="preserve">untuk E5.2.</w:t>
       </w:r>
     </w:p>
     <w:p>
@@ -3013,13 +2996,13 @@
       </w:r>
     </w:p>
     <w:bookmarkEnd w:id="24"/>
-    <w:bookmarkStart w:id="25" w:name="Xb8cba85fb914d63737f1554efcbf52c44028915"/>
+    <w:bookmarkStart w:id="25" w:name="X5e7ea80e50cf70ae6bd0b743973374b5e3ee925"/>
     <w:p>
       <w:pPr>
         <w:pStyle w:val="Heading2"/>
       </w:pPr>
       <w:r>
-        <w:t xml:space="preserve">6. Ahmad Falahi — QA, dokumentasi, dan foto (6,0 ho)</w:t>
+        <w:t xml:space="preserve">6. Ahmad Falahi — QA, dokumentasi, dan data ML (7,5 ho)</w:t>
       </w:r>
     </w:p>
     <w:p>
@@ -3033,13 +3016,7 @@
         <w:t xml:space="preserve"> </w:t>
       </w:r>
       <w:r>
-        <w:t xml:space="preserve">kode: rencana uji, foto lapangan, dan dokumentasi. Pelatihan model masuk setelah</w:t>
-      </w:r>
-      <w:r>
-        <w:t xml:space="preserve"> </w:t>
-      </w:r>
-      <w:r>
-        <w:t xml:space="preserve">mobile selesai.</w:t>
+        <w:t xml:space="preserve">kode, ditambah tugas data ML yang punya waktu tunggu panjang.</w:t>
       </w:r>
     </w:p>
     <w:tbl>
@@ -3305,29 +3282,29 @@
               <w:jc w:val="left"/>
             </w:pPr>
             <w:r>
-              <w:t xml:space="preserve">E10.2</w:t>
-            </w:r>
-          </w:p>
-        </w:tc>
-        <w:tc>
-          <w:p>
-            <w:pPr>
-              <w:pStyle w:val="Compact"/>
-              <w:jc w:val="left"/>
-            </w:pPr>
-            <w:r>
-              <w:t xml:space="preserve">150 foto lapangan untuk set uji</w:t>
-            </w:r>
-          </w:p>
-        </w:tc>
-        <w:tc>
-          <w:p>
-            <w:pPr>
-              <w:pStyle w:val="Compact"/>
-              <w:jc w:val="right"/>
-            </w:pPr>
-            <w:r>
-              <w:t xml:space="preserve">2,0</w:t>
+              <w:t xml:space="preserve">E4.1</w:t>
+            </w:r>
+          </w:p>
+        </w:tc>
+        <w:tc>
+          <w:p>
+            <w:pPr>
+              <w:pStyle w:val="Compact"/>
+              <w:jc w:val="left"/>
+            </w:pPr>
+            <w:r>
+              <w:t xml:space="preserve">Unduh dataset + EDA + buang kelas ambigu</w:t>
+            </w:r>
+          </w:p>
+        </w:tc>
+        <w:tc>
+          <w:p>
+            <w:pPr>
+              <w:pStyle w:val="Compact"/>
+              <w:jc w:val="right"/>
+            </w:pPr>
+            <w:r>
+              <w:t xml:space="preserve">1,0</w:t>
             </w:r>
           </w:p>
         </w:tc>
@@ -3349,18 +3326,18 @@
               <w:jc w:val="left"/>
             </w:pPr>
             <w:r>
-              <w:t xml:space="preserve">Minggu 5–6</w:t>
-            </w:r>
-          </w:p>
-        </w:tc>
-        <w:tc>
-          <w:p>
-            <w:pPr>
-              <w:pStyle w:val="Compact"/>
-              <w:jc w:val="left"/>
-            </w:pPr>
-            <w:r>
-              <w:t xml:space="preserve">Set foto siap</w:t>
+              <w:t xml:space="preserve">Minggu 5</w:t>
+            </w:r>
+          </w:p>
+        </w:tc>
+        <w:tc>
+          <w:p>
+            <w:pPr>
+              <w:pStyle w:val="Compact"/>
+              <w:jc w:val="left"/>
+            </w:pPr>
+            <w:r>
+              <w:t xml:space="preserve">Dataset bersih + laporan EDA</w:t>
             </w:r>
           </w:p>
         </w:tc>
@@ -3374,6 +3351,85 @@
             </w:pPr>
             <w:r>
               <w:t xml:space="preserve">4</w:t>
+            </w:r>
+          </w:p>
+        </w:tc>
+        <w:tc>
+          <w:p>
+            <w:pPr>
+              <w:pStyle w:val="Compact"/>
+              <w:jc w:val="left"/>
+            </w:pPr>
+            <w:r>
+              <w:t xml:space="preserve">E4.2</w:t>
+            </w:r>
+          </w:p>
+        </w:tc>
+        <w:tc>
+          <w:p>
+            <w:pPr>
+              <w:pStyle w:val="Compact"/>
+              <w:jc w:val="left"/>
+            </w:pPr>
+            <w:r>
+              <w:t xml:space="preserve">Gabung kelas + mapping + split 70/15/15</w:t>
+            </w:r>
+          </w:p>
+        </w:tc>
+        <w:tc>
+          <w:p>
+            <w:pPr>
+              <w:pStyle w:val="Compact"/>
+              <w:jc w:val="right"/>
+            </w:pPr>
+            <w:r>
+              <w:t xml:space="preserve">1,0</w:t>
+            </w:r>
+          </w:p>
+        </w:tc>
+        <w:tc>
+          <w:p>
+            <w:pPr>
+              <w:pStyle w:val="Compact"/>
+              <w:jc w:val="left"/>
+            </w:pPr>
+            <w:r>
+              <w:t xml:space="preserve">E4.1</w:t>
+            </w:r>
+          </w:p>
+        </w:tc>
+        <w:tc>
+          <w:p>
+            <w:pPr>
+              <w:pStyle w:val="Compact"/>
+              <w:jc w:val="left"/>
+            </w:pPr>
+            <w:r>
+              <w:t xml:space="preserve">Minggu 5–6</w:t>
+            </w:r>
+          </w:p>
+        </w:tc>
+        <w:tc>
+          <w:p>
+            <w:pPr>
+              <w:pStyle w:val="Compact"/>
+              <w:jc w:val="left"/>
+            </w:pPr>
+            <w:r>
+              <w:t xml:space="preserve">Mapping + split tersimpan</w:t>
+            </w:r>
+          </w:p>
+        </w:tc>
+      </w:tr>
+      <w:tr>
+        <w:tc>
+          <w:p>
+            <w:pPr>
+              <w:pStyle w:val="Compact"/>
+              <w:jc w:val="right"/>
+            </w:pPr>
+            <w:r>
+              <w:t xml:space="preserve">5</w:t>
             </w:r>
           </w:p>
         </w:tc>
@@ -3467,7 +3523,7 @@
               <w:jc w:val="right"/>
             </w:pPr>
             <w:r>
-              <w:t xml:space="preserve">5</w:t>
+              <w:t xml:space="preserve">6</w:t>
             </w:r>
           </w:p>
         </w:tc>
@@ -3534,90 +3590,19 @@
             </w:pPr>
             <w:r>
               <w:t xml:space="preserve">Outfit tersimpan terdaftar</w:t>
-            </w:r>
-          </w:p>
-        </w:tc>
-      </w:tr>
-      <w:tr>
-        <w:tc>
-          <w:p>
-            <w:pPr>
-              <w:pStyle w:val="Compact"/>
-              <w:jc w:val="right"/>
-            </w:pPr>
-            <w:r>
-              <w:t xml:space="preserve">6</w:t>
-            </w:r>
-          </w:p>
-        </w:tc>
-        <w:tc>
-          <w:p>
-            <w:pPr>
-              <w:pStyle w:val="Compact"/>
-              <w:jc w:val="left"/>
-            </w:pPr>
-            <w:r>
-              <w:t xml:space="preserve">E9.2</w:t>
-            </w:r>
-          </w:p>
-        </w:tc>
-        <w:tc>
-          <w:p>
-            <w:pPr>
-              <w:pStyle w:val="Compact"/>
-              <w:jc w:val="left"/>
-            </w:pPr>
-            <w:r>
-              <w:t xml:space="preserve">Eksekusi fungsional black-box + catat bug</w:t>
-            </w:r>
-          </w:p>
-        </w:tc>
-        <w:tc>
-          <w:p>
-            <w:pPr>
-              <w:pStyle w:val="Compact"/>
-              <w:jc w:val="right"/>
-            </w:pPr>
-            <w:r>
-              <w:t xml:space="preserve">2,0</w:t>
-            </w:r>
-          </w:p>
-        </w:tc>
-        <w:tc>
-          <w:p>
-            <w:pPr>
-              <w:pStyle w:val="Compact"/>
-              <w:jc w:val="left"/>
-            </w:pPr>
-            <w:r>
-              <w:t xml:space="preserve">E8.*</w:t>
-            </w:r>
-          </w:p>
-        </w:tc>
-        <w:tc>
-          <w:p>
-            <w:pPr>
-              <w:pStyle w:val="Compact"/>
-              <w:jc w:val="left"/>
-            </w:pPr>
-            <w:r>
-              <w:t xml:space="preserve">Minggu 9</w:t>
-            </w:r>
-          </w:p>
-        </w:tc>
-        <w:tc>
-          <w:p>
-            <w:pPr>
-              <w:pStyle w:val="Compact"/>
-              <w:jc w:val="left"/>
-            </w:pPr>
-            <w:r>
-              <w:t xml:space="preserve">Hasil tercatat</w:t>
             </w:r>
           </w:p>
         </w:tc>
       </w:tr>
     </w:tbl>
+    <w:p>
+      <w:pPr>
+        <w:pStyle w:val="BodyText"/>
+      </w:pPr>
+      <w:r>
+        <w:t xml:space="preserve">E4.1 hanya butuh waktu unduh, bukan pengerjaan penuh. Jalankan di sela E9.1.</w:t>
+      </w:r>
+    </w:p>
     <w:p>
       <w:r>
         <w:pict>
@@ -4243,7 +4228,7 @@
               <w:jc w:val="left"/>
             </w:pPr>
             <w:r>
-              <w:t xml:space="preserve">Faatihurrizki</w:t>
+              <w:t xml:space="preserve">Abim</w:t>
             </w:r>
           </w:p>
         </w:tc>
@@ -4387,6 +4372,20 @@
         </w:tc>
       </w:tr>
     </w:tbl>
+    <w:p>
+      <w:pPr>
+        <w:pStyle w:val="BodyText"/>
+      </w:pPr>
+      <w:r>
+        <w:t xml:space="preserve">Catatan: Faatihurrizki mengerjakan E6.1–E6.2 setelah rantai E2 selesai, karena</w:t>
+      </w:r>
+      <w:r>
+        <w:t xml:space="preserve"> </w:t>
+      </w:r>
+      <w:r>
+        <w:t xml:space="preserve">penyimpanan tetap prioritas lebih tinggi.</w:t>
+      </w:r>
+    </w:p>
     <w:p>
       <w:r>
         <w:pict>

</xml_diff>

<commit_message>
docs: panduan branch lengkap dan rujukan di semua dokumen kerja
</commit_message>
<xml_diff>
--- a/Pembagian Tugas/jobdesk-per-anggota.docx
+++ b/Pembagian Tugas/jobdesk-per-anggota.docx
@@ -3027,7 +3027,19 @@
         <w:pStyle w:val="Compact"/>
       </w:pPr>
       <w:r>
-        <w:t xml:space="preserve">Satu tugas = satu branch = satu PR.</w:t>
+        <w:t xml:space="preserve">Satu tugas = satu branch = satu PR. Nama branch dan alur PR mengikuti</w:t>
+      </w:r>
+      <w:r>
+        <w:t xml:space="preserve"> </w:t>
+      </w:r>
+      <w:r>
+        <w:rPr>
+          <w:rStyle w:val="VerbatimChar"/>
+        </w:rPr>
+        <w:t xml:space="preserve">Pembagian Tugas/panduan-branch.md</w:t>
+      </w:r>
+      <w:r>
+        <w:t xml:space="preserve">.</w:t>
       </w:r>
     </w:p>
     <w:p>

</xml_diff>

<commit_message>
docs: pindahkan aturan branch ke pembagian tugas minggu 5
</commit_message>
<xml_diff>
--- a/Pembagian Tugas/jobdesk-per-anggota.docx
+++ b/Pembagian Tugas/jobdesk-per-anggota.docx
@@ -3027,7 +3027,7 @@
         <w:pStyle w:val="Compact"/>
       </w:pPr>
       <w:r>
-        <w:t xml:space="preserve">Satu tugas = satu branch = satu PR. Nama branch dan alur PR mengikuti</w:t>
+        <w:t xml:space="preserve">Satu tugas = satu branch = satu PR. Nama branch per tugas ada di</w:t>
       </w:r>
       <w:r>
         <w:t xml:space="preserve"> </w:t>
@@ -3036,10 +3036,13 @@
         <w:rPr>
           <w:rStyle w:val="VerbatimChar"/>
         </w:rPr>
-        <w:t xml:space="preserve">Pembagian Tugas/panduan-branch.md</w:t>
-      </w:r>
-      <w:r>
-        <w:t xml:space="preserve">.</w:t>
+        <w:t xml:space="preserve">Pembagian Tugas/pembagian-tugas-minggu-5.docx</w:t>
+      </w:r>
+      <w:r>
+        <w:t xml:space="preserve"> </w:t>
+      </w:r>
+      <w:r>
+        <w:t xml:space="preserve">bagian 6.</w:t>
       </w:r>
     </w:p>
     <w:p>

</xml_diff>

<commit_message>
docs: blok ML terpisah dengan dev-ml dan pembagian tugas ML minggu 5
</commit_message>
<xml_diff>
--- a/Pembagian Tugas/jobdesk-per-anggota.docx
+++ b/Pembagian Tugas/jobdesk-per-anggota.docx
@@ -2,7 +2,7 @@
 <file path=word/document.xml><?xml version="1.0" encoding="utf-8"?>
 <w:document xmlns:w="http://schemas.openxmlformats.org/wordprocessingml/2006/main" xmlns:m="http://schemas.openxmlformats.org/officeDocument/2006/math" xmlns:r="http://schemas.openxmlformats.org/officeDocument/2006/relationships" xmlns:o="urn:schemas-microsoft-com:office:office" xmlns:v="urn:schemas-microsoft-com:vml" xmlns:w10="urn:schemas-microsoft-com:office:word" xmlns:a="http://schemas.openxmlformats.org/drawingml/2006/main" xmlns:pic="http://schemas.openxmlformats.org/drawingml/2006/picture" xmlns:wp="http://schemas.openxmlformats.org/drawingml/2006/wordprocessingDrawing">
   <w:body>
-    <w:bookmarkStart w:id="30" w:name="jobdesk-per-anggota--sera-z"/>
+    <w:bookmarkStart w:id="31" w:name="jobdesk-per-anggota--sera-z"/>
     <w:p>
       <w:pPr>
         <w:pStyle w:val="Heading1"/>
@@ -2719,13 +2719,13 @@
       </w:r>
     </w:p>
     <w:bookmarkEnd w:id="27"/>
-    <w:bookmarkStart w:id="28" w:name="Xeae4a8e1251476ad82fdf72f8662e5b67ff4e78"/>
+    <w:bookmarkStart w:id="28" w:name="X8ce8ed61c48b8e27847046b3490aee8247ca2f0"/>
     <w:p>
       <w:pPr>
         <w:pStyle w:val="Heading2"/>
       </w:pPr>
       <w:r>
-        <w:t xml:space="preserve">8. Setelah mobile selesai</w:t>
+        <w:t xml:space="preserve">8. Blok ML terpisah (2 – 4 November 2026)</w:t>
       </w:r>
     </w:p>
     <w:p>
@@ -2733,7 +2733,40 @@
         <w:pStyle w:val="FirstParagraph"/>
       </w:pPr>
       <w:r>
-        <w:t xml:space="preserve">Baru dimulai setelah E2, E3, dan E8.1-E8.7 (yang tidak menunggu ML) lulus uji:</w:t>
+        <w:t xml:space="preserve">ML dikerjakan setelah mobile selesai, memakai branch integrasi</w:t>
+      </w:r>
+      <w:r>
+        <w:t xml:space="preserve"> </w:t>
+      </w:r>
+      <w:r>
+        <w:rPr>
+          <w:rStyle w:val="VerbatimChar"/>
+        </w:rPr>
+        <w:t xml:space="preserve">dev-ml</w:t>
+      </w:r>
+      <w:r>
+        <w:t xml:space="preserve"> </w:t>
+      </w:r>
+      <w:r>
+        <w:t xml:space="preserve">yang</w:t>
+      </w:r>
+      <w:r>
+        <w:t xml:space="preserve"> </w:t>
+      </w:r>
+      <w:r>
+        <w:t xml:space="preserve">dibuat dari</w:t>
+      </w:r>
+      <w:r>
+        <w:t xml:space="preserve"> </w:t>
+      </w:r>
+      <w:r>
+        <w:rPr>
+          <w:rStyle w:val="VerbatimChar"/>
+        </w:rPr>
+        <w:t xml:space="preserve">dev</w:t>
+      </w:r>
+      <w:r>
+        <w:t xml:space="preserve">.</w:t>
       </w:r>
     </w:p>
     <w:tbl>
@@ -2751,29 +2784,51 @@
               <w:jc w:val="left"/>
             </w:pPr>
             <w:r>
-              <w:t xml:space="preserve">Urutan</w:t>
-            </w:r>
-          </w:p>
-        </w:tc>
-        <w:tc>
-          <w:p>
-            <w:pPr>
-              <w:pStyle w:val="Compact"/>
-              <w:jc w:val="left"/>
-            </w:pPr>
-            <w:r>
-              <w:t xml:space="preserve">Pekerjaan</w:t>
-            </w:r>
-          </w:p>
-        </w:tc>
-        <w:tc>
-          <w:p>
-            <w:pPr>
-              <w:pStyle w:val="Compact"/>
-              <w:jc w:val="left"/>
-            </w:pPr>
-            <w:r>
-              <w:t xml:space="preserve">Mulai</w:t>
+              <w:t xml:space="preserve">Anggota</w:t>
+            </w:r>
+          </w:p>
+        </w:tc>
+        <w:tc>
+          <w:p>
+            <w:pPr>
+              <w:pStyle w:val="Compact"/>
+              <w:jc w:val="left"/>
+            </w:pPr>
+            <w:r>
+              <w:t xml:space="preserve">Tugas ML</w:t>
+            </w:r>
+          </w:p>
+        </w:tc>
+        <w:tc>
+          <w:p>
+            <w:pPr>
+              <w:pStyle w:val="Compact"/>
+              <w:jc w:val="right"/>
+            </w:pPr>
+            <w:r>
+              <w:t xml:space="preserve">ho</w:t>
+            </w:r>
+          </w:p>
+        </w:tc>
+        <w:tc>
+          <w:p>
+            <w:pPr>
+              <w:pStyle w:val="Compact"/>
+              <w:jc w:val="left"/>
+            </w:pPr>
+            <w:r>
+              <w:t xml:space="preserve">Branch</w:t>
+            </w:r>
+          </w:p>
+        </w:tc>
+        <w:tc>
+          <w:p>
+            <w:pPr>
+              <w:pStyle w:val="Compact"/>
+              <w:jc w:val="left"/>
+            </w:pPr>
+            <w:r>
+              <w:t xml:space="preserve">PR ke</w:t>
             </w:r>
           </w:p>
         </w:tc>
@@ -2786,29 +2841,69 @@
               <w:jc w:val="left"/>
             </w:pPr>
             <w:r>
-              <w:t xml:space="preserve">1</w:t>
-            </w:r>
-          </w:p>
-        </w:tc>
-        <w:tc>
-          <w:p>
-            <w:pPr>
-              <w:pStyle w:val="Compact"/>
-              <w:jc w:val="left"/>
-            </w:pPr>
-            <w:r>
-              <w:t xml:space="preserve">E5 modul warna (pemrosesan gambar)</w:t>
-            </w:r>
-          </w:p>
-        </w:tc>
-        <w:tc>
-          <w:p>
-            <w:pPr>
-              <w:pStyle w:val="Compact"/>
-              <w:jc w:val="left"/>
-            </w:pPr>
-            <w:r>
-              <w:t xml:space="preserve">Minggu 7</w:t>
+              <w:t xml:space="preserve">Bisma</w:t>
+            </w:r>
+          </w:p>
+        </w:tc>
+        <w:tc>
+          <w:p>
+            <w:pPr>
+              <w:pStyle w:val="Compact"/>
+              <w:jc w:val="left"/>
+            </w:pPr>
+            <w:r>
+              <w:t xml:space="preserve">E4.1 ekstrak 3 ZIP + verifikasi, E4.2 split, latih ulang 12 epoch</w:t>
+            </w:r>
+          </w:p>
+        </w:tc>
+        <w:tc>
+          <w:p>
+            <w:pPr>
+              <w:pStyle w:val="Compact"/>
+              <w:jc w:val="right"/>
+            </w:pPr>
+            <w:r>
+              <w:t xml:space="preserve">3,0</w:t>
+            </w:r>
+          </w:p>
+        </w:tc>
+        <w:tc>
+          <w:p>
+            <w:pPr>
+              <w:pStyle w:val="Compact"/>
+              <w:jc w:val="left"/>
+            </w:pPr>
+            <w:r>
+              <w:rPr>
+                <w:rStyle w:val="VerbatimChar"/>
+              </w:rPr>
+              <w:t xml:space="preserve">ml/dataset-eda</w:t>
+            </w:r>
+            <w:r>
+              <w:t xml:space="preserve">,</w:t>
+            </w:r>
+            <w:r>
+              <w:t xml:space="preserve"> </w:t>
+            </w:r>
+            <w:r>
+              <w:rPr>
+                <w:rStyle w:val="VerbatimChar"/>
+              </w:rPr>
+              <w:t xml:space="preserve">ml/train-model1</w:t>
+            </w:r>
+          </w:p>
+        </w:tc>
+        <w:tc>
+          <w:p>
+            <w:pPr>
+              <w:pStyle w:val="Compact"/>
+              <w:jc w:val="left"/>
+            </w:pPr>
+            <w:r>
+              <w:rPr>
+                <w:rStyle w:val="VerbatimChar"/>
+              </w:rPr>
+              <w:t xml:space="preserve">dev-ml</w:t>
             </w:r>
           </w:p>
         </w:tc>
@@ -2821,29 +2916,57 @@
               <w:jc w:val="left"/>
             </w:pPr>
             <w:r>
-              <w:t xml:space="preserve">2</w:t>
-            </w:r>
-          </w:p>
-        </w:tc>
-        <w:tc>
-          <w:p>
-            <w:pPr>
-              <w:pStyle w:val="Compact"/>
-              <w:jc w:val="left"/>
-            </w:pPr>
-            <w:r>
-              <w:t xml:space="preserve">E4.1-E4.6 Model 1</w:t>
-            </w:r>
-          </w:p>
-        </w:tc>
-        <w:tc>
-          <w:p>
-            <w:pPr>
-              <w:pStyle w:val="Compact"/>
-              <w:jc w:val="left"/>
-            </w:pPr>
-            <w:r>
-              <w:t xml:space="preserve">Minggu 7</w:t>
+              <w:t xml:space="preserve">Ahmad</w:t>
+            </w:r>
+          </w:p>
+        </w:tc>
+        <w:tc>
+          <w:p>
+            <w:pPr>
+              <w:pStyle w:val="Compact"/>
+              <w:jc w:val="left"/>
+            </w:pPr>
+            <w:r>
+              <w:t xml:space="preserve">E4.5 evaluasi Model 1, E4.6 verifikasi ekspor + model card</w:t>
+            </w:r>
+          </w:p>
+        </w:tc>
+        <w:tc>
+          <w:p>
+            <w:pPr>
+              <w:pStyle w:val="Compact"/>
+              <w:jc w:val="right"/>
+            </w:pPr>
+            <w:r>
+              <w:t xml:space="preserve">1,5</w:t>
+            </w:r>
+          </w:p>
+        </w:tc>
+        <w:tc>
+          <w:p>
+            <w:pPr>
+              <w:pStyle w:val="Compact"/>
+              <w:jc w:val="left"/>
+            </w:pPr>
+            <w:r>
+              <w:rPr>
+                <w:rStyle w:val="VerbatimChar"/>
+              </w:rPr>
+              <w:t xml:space="preserve">ml/eval-model1</w:t>
+            </w:r>
+          </w:p>
+        </w:tc>
+        <w:tc>
+          <w:p>
+            <w:pPr>
+              <w:pStyle w:val="Compact"/>
+              <w:jc w:val="left"/>
+            </w:pPr>
+            <w:r>
+              <w:rPr>
+                <w:rStyle w:val="VerbatimChar"/>
+              </w:rPr>
+              <w:t xml:space="preserve">dev-ml</w:t>
             </w:r>
           </w:p>
         </w:tc>
@@ -2856,29 +2979,57 @@
               <w:jc w:val="left"/>
             </w:pPr>
             <w:r>
-              <w:t xml:space="preserve">3</w:t>
-            </w:r>
-          </w:p>
-        </w:tc>
-        <w:tc>
-          <w:p>
-            <w:pPr>
-              <w:pStyle w:val="Compact"/>
-              <w:jc w:val="left"/>
-            </w:pPr>
-            <w:r>
-              <w:t xml:space="preserve">E6.1-E6.6 Model 3</w:t>
-            </w:r>
-          </w:p>
-        </w:tc>
-        <w:tc>
-          <w:p>
-            <w:pPr>
-              <w:pStyle w:val="Compact"/>
-              <w:jc w:val="left"/>
-            </w:pPr>
-            <w:r>
-              <w:t xml:space="preserve">Minggu 8</w:t>
+              <w:t xml:space="preserve">Pras</w:t>
+            </w:r>
+          </w:p>
+        </w:tc>
+        <w:tc>
+          <w:p>
+            <w:pPr>
+              <w:pStyle w:val="Compact"/>
+              <w:jc w:val="left"/>
+            </w:pPr>
+            <w:r>
+              <w:t xml:space="preserve">E6.5 metrik Model 3 + review PR</w:t>
+            </w:r>
+          </w:p>
+        </w:tc>
+        <w:tc>
+          <w:p>
+            <w:pPr>
+              <w:pStyle w:val="Compact"/>
+              <w:jc w:val="right"/>
+            </w:pPr>
+            <w:r>
+              <w:t xml:space="preserve">1,0</w:t>
+            </w:r>
+          </w:p>
+        </w:tc>
+        <w:tc>
+          <w:p>
+            <w:pPr>
+              <w:pStyle w:val="Compact"/>
+              <w:jc w:val="left"/>
+            </w:pPr>
+            <w:r>
+              <w:rPr>
+                <w:rStyle w:val="VerbatimChar"/>
+              </w:rPr>
+              <w:t xml:space="preserve">ml/model3-metrics</w:t>
+            </w:r>
+          </w:p>
+        </w:tc>
+        <w:tc>
+          <w:p>
+            <w:pPr>
+              <w:pStyle w:val="Compact"/>
+              <w:jc w:val="left"/>
+            </w:pPr>
+            <w:r>
+              <w:rPr>
+                <w:rStyle w:val="VerbatimChar"/>
+              </w:rPr>
+              <w:t xml:space="preserve">dev-ml</w:t>
             </w:r>
           </w:p>
         </w:tc>
@@ -2891,29 +3042,57 @@
               <w:jc w:val="left"/>
             </w:pPr>
             <w:r>
-              <w:t xml:space="preserve">4</w:t>
-            </w:r>
-          </w:p>
-        </w:tc>
-        <w:tc>
-          <w:p>
-            <w:pPr>
-              <w:pStyle w:val="Compact"/>
-              <w:jc w:val="left"/>
-            </w:pPr>
-            <w:r>
-              <w:t xml:space="preserve">E7.1-E7.6 integrasi TFLite</w:t>
-            </w:r>
-          </w:p>
-        </w:tc>
-        <w:tc>
-          <w:p>
-            <w:pPr>
-              <w:pStyle w:val="Compact"/>
-              <w:jc w:val="left"/>
-            </w:pPr>
-            <w:r>
-              <w:t xml:space="preserve">Minggu 9</w:t>
+              <w:t xml:space="preserve">Abim</w:t>
+            </w:r>
+          </w:p>
+        </w:tc>
+        <w:tc>
+          <w:p>
+            <w:pPr>
+              <w:pStyle w:val="Compact"/>
+              <w:jc w:val="left"/>
+            </w:pPr>
+            <w:r>
+              <w:t xml:space="preserve">Label 9 kelas, aset model, smoke test</w:t>
+            </w:r>
+          </w:p>
+        </w:tc>
+        <w:tc>
+          <w:p>
+            <w:pPr>
+              <w:pStyle w:val="Compact"/>
+              <w:jc w:val="right"/>
+            </w:pPr>
+            <w:r>
+              <w:t xml:space="preserve">1,0</w:t>
+            </w:r>
+          </w:p>
+        </w:tc>
+        <w:tc>
+          <w:p>
+            <w:pPr>
+              <w:pStyle w:val="Compact"/>
+              <w:jc w:val="left"/>
+            </w:pPr>
+            <w:r>
+              <w:rPr>
+                <w:rStyle w:val="VerbatimChar"/>
+              </w:rPr>
+              <w:t xml:space="preserve">chore/model-assets</w:t>
+            </w:r>
+          </w:p>
+        </w:tc>
+        <w:tc>
+          <w:p>
+            <w:pPr>
+              <w:pStyle w:val="Compact"/>
+              <w:jc w:val="left"/>
+            </w:pPr>
+            <w:r>
+              <w:rPr>
+                <w:rStyle w:val="VerbatimChar"/>
+              </w:rPr>
+              <w:t xml:space="preserve">dev</w:t>
             </w:r>
           </w:p>
         </w:tc>
@@ -2926,29 +3105,57 @@
               <w:jc w:val="left"/>
             </w:pPr>
             <w:r>
-              <w:t xml:space="preserve">5</w:t>
-            </w:r>
-          </w:p>
-        </w:tc>
-        <w:tc>
-          <w:p>
-            <w:pPr>
-              <w:pStyle w:val="Compact"/>
-              <w:jc w:val="left"/>
-            </w:pPr>
-            <w:r>
-              <w:t xml:space="preserve">E8.3, E8.5</w:t>
-            </w:r>
-          </w:p>
-        </w:tc>
-        <w:tc>
-          <w:p>
-            <w:pPr>
-              <w:pStyle w:val="Compact"/>
-              <w:jc w:val="left"/>
-            </w:pPr>
-            <w:r>
-              <w:t xml:space="preserve">Minggu 9</w:t>
+              <w:t xml:space="preserve">Izza</w:t>
+            </w:r>
+          </w:p>
+        </w:tc>
+        <w:tc>
+          <w:p>
+            <w:pPr>
+              <w:pStyle w:val="Compact"/>
+              <w:jc w:val="left"/>
+            </w:pPr>
+            <w:r>
+              <w:t xml:space="preserve">Dokumentasi metode ML</w:t>
+            </w:r>
+          </w:p>
+        </w:tc>
+        <w:tc>
+          <w:p>
+            <w:pPr>
+              <w:pStyle w:val="Compact"/>
+              <w:jc w:val="right"/>
+            </w:pPr>
+            <w:r>
+              <w:t xml:space="preserve">1,0</w:t>
+            </w:r>
+          </w:p>
+        </w:tc>
+        <w:tc>
+          <w:p>
+            <w:pPr>
+              <w:pStyle w:val="Compact"/>
+              <w:jc w:val="left"/>
+            </w:pPr>
+            <w:r>
+              <w:rPr>
+                <w:rStyle w:val="VerbatimChar"/>
+              </w:rPr>
+              <w:t xml:space="preserve">docs/ml-methods</w:t>
+            </w:r>
+          </w:p>
+        </w:tc>
+        <w:tc>
+          <w:p>
+            <w:pPr>
+              <w:pStyle w:val="Compact"/>
+              <w:jc w:val="left"/>
+            </w:pPr>
+            <w:r>
+              <w:rPr>
+                <w:rStyle w:val="VerbatimChar"/>
+              </w:rPr>
+              <w:t xml:space="preserve">dev-ml</w:t>
             </w:r>
           </w:p>
         </w:tc>
@@ -2961,35 +3168,80 @@
               <w:jc w:val="left"/>
             </w:pPr>
             <w:r>
-              <w:t xml:space="preserve">6</w:t>
-            </w:r>
-          </w:p>
-        </w:tc>
-        <w:tc>
-          <w:p>
-            <w:pPr>
-              <w:pStyle w:val="Compact"/>
-              <w:jc w:val="left"/>
-            </w:pPr>
-            <w:r>
-              <w:t xml:space="preserve">E9 QA dan E10 dokumentasi</w:t>
-            </w:r>
-          </w:p>
-        </w:tc>
-        <w:tc>
-          <w:p>
-            <w:pPr>
-              <w:pStyle w:val="Compact"/>
-              <w:jc w:val="left"/>
-            </w:pPr>
-            <w:r>
-              <w:t xml:space="preserve">Minggu 9-10</w:t>
-            </w:r>
-          </w:p>
+              <w:rPr>
+                <w:bCs/>
+                <w:b/>
+              </w:rPr>
+              <w:t xml:space="preserve">Total</w:t>
+            </w:r>
+          </w:p>
+        </w:tc>
+        <w:tc>
+          <w:p/>
+        </w:tc>
+        <w:tc>
+          <w:p>
+            <w:pPr>
+              <w:pStyle w:val="Compact"/>
+              <w:jc w:val="right"/>
+            </w:pPr>
+            <w:r>
+              <w:rPr>
+                <w:bCs/>
+                <w:b/>
+              </w:rPr>
+              <w:t xml:space="preserve">7,5</w:t>
+            </w:r>
+          </w:p>
+        </w:tc>
+        <w:tc>
+          <w:p/>
+        </w:tc>
+        <w:tc>
+          <w:p/>
         </w:tc>
       </w:tr>
     </w:tbl>
     <w:p>
+      <w:pPr>
+        <w:pStyle w:val="BodyText"/>
+      </w:pPr>
+      <w:r>
+        <w:t xml:space="preserve">Alur branch:</w:t>
+      </w:r>
+    </w:p>
+    <w:p>
+      <w:pPr>
+        <w:pStyle w:val="SourceCode"/>
+      </w:pPr>
+      <w:r>
+        <w:rPr>
+          <w:rStyle w:val="VerbatimChar"/>
+        </w:rPr>
+        <w:t xml:space="preserve">dev ──► dev-ml ──► ml/... ──PR──► dev-ml ──► (stabil) PR ke dev</w:t>
+      </w:r>
+    </w:p>
+    <w:p>
+      <w:pPr>
+        <w:pStyle w:val="FirstParagraph"/>
+      </w:pPr>
+      <w:r>
+        <w:t xml:space="preserve">Rincian langkah:</w:t>
+      </w:r>
+      <w:r>
+        <w:t xml:space="preserve"> </w:t>
+      </w:r>
+      <w:r>
+        <w:rPr>
+          <w:rStyle w:val="VerbatimChar"/>
+        </w:rPr>
+        <w:t xml:space="preserve">Pembagian Tugas/pembagian-tugas-ml-minggu-5.docx</w:t>
+      </w:r>
+      <w:r>
+        <w:t xml:space="preserve">.</w:t>
+      </w:r>
+    </w:p>
+    <w:p>
       <w:r>
         <w:pict>
           <v:rect style="width:0;height:1.5pt" o:hralign="center" o:hrstd="t" o:hr="t"/>
@@ -2997,13 +3249,283 @@
       </w:r>
     </w:p>
     <w:bookmarkEnd w:id="28"/>
-    <w:bookmarkStart w:id="29" w:name="X11c7ef03202c127b9bcbaf45b05146bf1ad84d3"/>
+    <w:bookmarkStart w:id="29" w:name="X8ff8b4b33ed0a2fdbe5d35c0351e4dcb8e23876"/>
     <w:p>
       <w:pPr>
         <w:pStyle w:val="Heading2"/>
       </w:pPr>
       <w:r>
-        <w:t xml:space="preserve">9. Aturan</w:t>
+        <w:t xml:space="preserve">9. Setelah blok ML selesai</w:t>
+      </w:r>
+    </w:p>
+    <w:tbl>
+      <w:tblPr>
+        <w:tblStyle w:val="Table"/>
+        <w:tblW w:type="pct" w:w="0.0"/>
+        <w:tblLook w:firstRow="1" w:lastRow="0" w:firstColumn="0" w:lastColumn="0" w:noHBand="0" w:noVBand="0" w:val="0020"/>
+      </w:tblPr>
+      <w:tblGrid/>
+      <w:tr>
+        <w:tc>
+          <w:p>
+            <w:pPr>
+              <w:pStyle w:val="Compact"/>
+              <w:jc w:val="left"/>
+            </w:pPr>
+            <w:r>
+              <w:t xml:space="preserve">Urutan</w:t>
+            </w:r>
+          </w:p>
+        </w:tc>
+        <w:tc>
+          <w:p>
+            <w:pPr>
+              <w:pStyle w:val="Compact"/>
+              <w:jc w:val="left"/>
+            </w:pPr>
+            <w:r>
+              <w:t xml:space="preserve">Pekerjaan</w:t>
+            </w:r>
+          </w:p>
+        </w:tc>
+        <w:tc>
+          <w:p>
+            <w:pPr>
+              <w:pStyle w:val="Compact"/>
+              <w:jc w:val="left"/>
+            </w:pPr>
+            <w:r>
+              <w:t xml:space="preserve">Mulai</w:t>
+            </w:r>
+          </w:p>
+        </w:tc>
+      </w:tr>
+      <w:tr>
+        <w:tc>
+          <w:p>
+            <w:pPr>
+              <w:pStyle w:val="Compact"/>
+              <w:jc w:val="left"/>
+            </w:pPr>
+            <w:r>
+              <w:t xml:space="preserve">1</w:t>
+            </w:r>
+          </w:p>
+        </w:tc>
+        <w:tc>
+          <w:p>
+            <w:pPr>
+              <w:pStyle w:val="Compact"/>
+              <w:jc w:val="left"/>
+            </w:pPr>
+            <w:r>
+              <w:t xml:space="preserve">E7.1-E7.3 integrasi Model 1 dan modul warna</w:t>
+            </w:r>
+          </w:p>
+        </w:tc>
+        <w:tc>
+          <w:p>
+            <w:pPr>
+              <w:pStyle w:val="Compact"/>
+              <w:jc w:val="left"/>
+            </w:pPr>
+            <w:r>
+              <w:t xml:space="preserve">5 November</w:t>
+            </w:r>
+          </w:p>
+        </w:tc>
+      </w:tr>
+      <w:tr>
+        <w:tc>
+          <w:p>
+            <w:pPr>
+              <w:pStyle w:val="Compact"/>
+              <w:jc w:val="left"/>
+            </w:pPr>
+            <w:r>
+              <w:t xml:space="preserve">2</w:t>
+            </w:r>
+          </w:p>
+        </w:tc>
+        <w:tc>
+          <w:p>
+            <w:pPr>
+              <w:pStyle w:val="Compact"/>
+              <w:jc w:val="left"/>
+            </w:pPr>
+            <w:r>
+              <w:t xml:space="preserve">E6.1-E6.6 penyempurnaan Model 3</w:t>
+            </w:r>
+          </w:p>
+        </w:tc>
+        <w:tc>
+          <w:p>
+            <w:pPr>
+              <w:pStyle w:val="Compact"/>
+              <w:jc w:val="left"/>
+            </w:pPr>
+            <w:r>
+              <w:t xml:space="preserve">Minggu 7</w:t>
+            </w:r>
+          </w:p>
+        </w:tc>
+      </w:tr>
+      <w:tr>
+        <w:tc>
+          <w:p>
+            <w:pPr>
+              <w:pStyle w:val="Compact"/>
+              <w:jc w:val="left"/>
+            </w:pPr>
+            <w:r>
+              <w:t xml:space="preserve">3</w:t>
+            </w:r>
+          </w:p>
+        </w:tc>
+        <w:tc>
+          <w:p>
+            <w:pPr>
+              <w:pStyle w:val="Compact"/>
+              <w:jc w:val="left"/>
+            </w:pPr>
+            <w:r>
+              <w:t xml:space="preserve">E7.4-E7.6 skor Model 3, fallback, latensi</w:t>
+            </w:r>
+          </w:p>
+        </w:tc>
+        <w:tc>
+          <w:p>
+            <w:pPr>
+              <w:pStyle w:val="Compact"/>
+              <w:jc w:val="left"/>
+            </w:pPr>
+            <w:r>
+              <w:t xml:space="preserve">Minggu 7-8</w:t>
+            </w:r>
+          </w:p>
+        </w:tc>
+      </w:tr>
+      <w:tr>
+        <w:tc>
+          <w:p>
+            <w:pPr>
+              <w:pStyle w:val="Compact"/>
+              <w:jc w:val="left"/>
+            </w:pPr>
+            <w:r>
+              <w:t xml:space="preserve">4</w:t>
+            </w:r>
+          </w:p>
+        </w:tc>
+        <w:tc>
+          <w:p>
+            <w:pPr>
+              <w:pStyle w:val="Compact"/>
+              <w:jc w:val="left"/>
+            </w:pPr>
+            <w:r>
+              <w:t xml:space="preserve">E8.3, E8.5</w:t>
+            </w:r>
+          </w:p>
+        </w:tc>
+        <w:tc>
+          <w:p>
+            <w:pPr>
+              <w:pStyle w:val="Compact"/>
+              <w:jc w:val="left"/>
+            </w:pPr>
+            <w:r>
+              <w:t xml:space="preserve">Minggu 8</w:t>
+            </w:r>
+          </w:p>
+        </w:tc>
+      </w:tr>
+      <w:tr>
+        <w:tc>
+          <w:p>
+            <w:pPr>
+              <w:pStyle w:val="Compact"/>
+              <w:jc w:val="left"/>
+            </w:pPr>
+            <w:r>
+              <w:t xml:space="preserve">5</w:t>
+            </w:r>
+          </w:p>
+        </w:tc>
+        <w:tc>
+          <w:p>
+            <w:pPr>
+              <w:pStyle w:val="Compact"/>
+              <w:jc w:val="left"/>
+            </w:pPr>
+            <w:r>
+              <w:t xml:space="preserve">E5 modul warna</w:t>
+            </w:r>
+          </w:p>
+        </w:tc>
+        <w:tc>
+          <w:p>
+            <w:pPr>
+              <w:pStyle w:val="Compact"/>
+              <w:jc w:val="left"/>
+            </w:pPr>
+            <w:r>
+              <w:t xml:space="preserve">Minggu 8</w:t>
+            </w:r>
+          </w:p>
+        </w:tc>
+      </w:tr>
+      <w:tr>
+        <w:tc>
+          <w:p>
+            <w:pPr>
+              <w:pStyle w:val="Compact"/>
+              <w:jc w:val="left"/>
+            </w:pPr>
+            <w:r>
+              <w:t xml:space="preserve">6</w:t>
+            </w:r>
+          </w:p>
+        </w:tc>
+        <w:tc>
+          <w:p>
+            <w:pPr>
+              <w:pStyle w:val="Compact"/>
+              <w:jc w:val="left"/>
+            </w:pPr>
+            <w:r>
+              <w:t xml:space="preserve">E9 QA dan E10 dokumentasi</w:t>
+            </w:r>
+          </w:p>
+        </w:tc>
+        <w:tc>
+          <w:p>
+            <w:pPr>
+              <w:pStyle w:val="Compact"/>
+              <w:jc w:val="left"/>
+            </w:pPr>
+            <w:r>
+              <w:t xml:space="preserve">Minggu 9-10</w:t>
+            </w:r>
+          </w:p>
+        </w:tc>
+      </w:tr>
+    </w:tbl>
+    <w:p>
+      <w:r>
+        <w:pict>
+          <v:rect style="width:0;height:1.5pt" o:hralign="center" o:hrstd="t" o:hr="t"/>
+        </w:pict>
+      </w:r>
+    </w:p>
+    <w:bookmarkEnd w:id="29"/>
+    <w:bookmarkStart w:id="30" w:name="X7cbe17390da93ea08c36b9005b838ee627f9af4"/>
+    <w:p>
+      <w:pPr>
+        <w:pStyle w:val="Heading2"/>
+      </w:pPr>
+      <w:r>
+        <w:t xml:space="preserve">10. Aturan</w:t>
       </w:r>
     </w:p>
     <w:p>
@@ -3027,7 +3549,7 @@
         <w:pStyle w:val="Compact"/>
       </w:pPr>
       <w:r>
-        <w:t xml:space="preserve">Satu tugas = satu branch = satu PR. Nama branch per tugas ada di</w:t>
+        <w:t xml:space="preserve">Satu tugas = satu branch = satu PR. Untuk mobile, branch dari</w:t>
       </w:r>
       <w:r>
         <w:t xml:space="preserve"> </w:t>
@@ -3036,13 +3558,52 @@
         <w:rPr>
           <w:rStyle w:val="VerbatimChar"/>
         </w:rPr>
-        <w:t xml:space="preserve">Pembagian Tugas/pembagian-tugas-minggu-5.docx</w:t>
+        <w:t xml:space="preserve">dev</w:t>
       </w:r>
       <w:r>
         <w:t xml:space="preserve"> </w:t>
       </w:r>
       <w:r>
-        <w:t xml:space="preserve">bagian 6.</w:t>
+        <w:t xml:space="preserve">dan PR ke</w:t>
+      </w:r>
+      <w:r>
+        <w:t xml:space="preserve"> </w:t>
+      </w:r>
+      <w:r>
+        <w:rPr>
+          <w:rStyle w:val="VerbatimChar"/>
+        </w:rPr>
+        <w:t xml:space="preserve">dev</w:t>
+      </w:r>
+      <w:r>
+        <w:t xml:space="preserve">. Untuk ML, branch dari</w:t>
+      </w:r>
+      <w:r>
+        <w:t xml:space="preserve"> </w:t>
+      </w:r>
+      <w:r>
+        <w:rPr>
+          <w:rStyle w:val="VerbatimChar"/>
+        </w:rPr>
+        <w:t xml:space="preserve">dev-ml</w:t>
+      </w:r>
+      <w:r>
+        <w:t xml:space="preserve"> </w:t>
+      </w:r>
+      <w:r>
+        <w:t xml:space="preserve">dan PR ke</w:t>
+      </w:r>
+      <w:r>
+        <w:t xml:space="preserve"> </w:t>
+      </w:r>
+      <w:r>
+        <w:rPr>
+          <w:rStyle w:val="VerbatimChar"/>
+        </w:rPr>
+        <w:t xml:space="preserve">dev-ml</w:t>
+      </w:r>
+      <w:r>
+        <w:t xml:space="preserve">.</w:t>
       </w:r>
     </w:p>
     <w:p>
@@ -3078,13 +3639,13 @@
         <w:pStyle w:val="Compact"/>
       </w:pPr>
       <w:r>
-        <w:t xml:space="preserve">Anggota yang selesai lebih cepat boleh mengambil tugas mobile lain yang</w:t>
+        <w:t xml:space="preserve">Anggota yang selesai lebih cepat boleh mengambil tugas lain yang belum</w:t>
       </w:r>
       <w:r>
         <w:t xml:space="preserve"> </w:t>
       </w:r>
       <w:r>
-        <w:t xml:space="preserve">belum selesai, dengan tetap maksimal 2 tugas aktif.</w:t>
+        <w:t xml:space="preserve">selesai, dengan tetap maksimal 2 tugas aktif.</w:t>
       </w:r>
     </w:p>
     <w:p>
@@ -3099,8 +3660,8 @@
         <w:t xml:space="preserve">Status Notion dan logbook diperbarui setiap hari.</w:t>
       </w:r>
     </w:p>
-    <w:bookmarkEnd w:id="29"/>
     <w:bookmarkEnd w:id="30"/>
+    <w:bookmarkEnd w:id="31"/>
     <w:sectPr/>
   </w:body>
 </w:document>

</xml_diff>